<commit_message>
Auto-build resume: Chinese + English (HTML/DOCX/PDF)
  Generated from resume.html using GitHub Actions
  - resume.en.html: auto-translated via free translation API
  - Chinese: PDF (weasyprint) + DOCX (python-docx)
  - English: PDF (weasyprint) + DOCX (python-docx)
</commit_message>
<xml_diff>
--- a/Resume Qian Jiahong.docx
+++ b/Resume Qian Jiahong.docx
@@ -41,7 +41,7 @@
           <w:color w:val="333333"/>
           <w:sz w:val="18"/>
         </w:rPr>
-        <w:t>Birthday:  2006  height:  185cm</w:t>
+        <w:t>&lt;g id="Bold"&gt;Date of Birth:&lt;/g&gt;  2006  &lt;g id="Bold"&gt;Height:&lt;/g&gt;  185cm</w:t>
       </w:r>
     </w:p>
     <w:p>
@@ -55,7 +55,7 @@
           <w:color w:val="333333"/>
           <w:sz w:val="18"/>
         </w:rPr>
-        <w:t>Education:  Undergraduate  address:  Shanghai</w:t>
+        <w:t>Education:  Undergraduate (Shanghai Jianqiao College · Postgraduate, enrolled in September 2026)  Address:  Shanghai City</w:t>
       </w:r>
     </w:p>
     <w:p>
@@ -69,7 +69,7 @@
           <w:color w:val="333333"/>
           <w:sz w:val="18"/>
         </w:rPr>
-        <w:t>Telephone:  19921057118  Mail:  aqfxz_zh@qq.com</w:t>
+        <w:t>Tél.  19921057118  E-mail:  aqfxz_zh@qq.com</w:t>
       </w:r>
     </w:p>
     <w:p>
@@ -83,7 +83,7 @@
           <w:color w:val="555555"/>
           <w:sz w:val="16"/>
         </w:rPr>
-        <w:t>Open source libraries:github.com/lxcxjxhx/HOS-Qian-jia-hong-resume    blog:security-hyacinth.blog.csdn.net</w:t>
+        <w:t>GitHub:github.com/lxcxjxhx    Blog:security-hyacinth.blog.csdn.net</w:t>
       </w:r>
       <w:r>
         <w:rPr>
@@ -92,7 +92,7 @@
           <w:color w:val="555555"/>
           <w:sz w:val="16"/>
         </w:rPr>
-        <w:t>arXiv:arxiv.org/search/?query=JH-Qian    LinkedIn:linkedin.com/in/jiahong-qian</w:t>
+        <w:t>arXiv:arxiv.org/search/?query=JH-Qian    LinkedIn:linkedin.com/in/ Jia Hong - Money</w:t>
       </w:r>
     </w:p>
     <w:p>
@@ -107,7 +107,7 @@
           <w:color w:val="FFFFFF"/>
           <w:sz w:val="22"/>
         </w:rPr>
-        <w:t xml:space="preserve">  Internship experience</w:t>
+        <w:t xml:space="preserve">  Internship</w:t>
       </w:r>
     </w:p>
     <w:p>
@@ -121,7 +121,7 @@
           <w:color w:val="2C3E50"/>
           <w:sz w:val="20"/>
         </w:rPr>
-        <w:t>NSFOCUS Technology Group Co., Ltd. Shanghai Branch</w:t>
+        <w:t>Lvmeng Technology Group Co., Ltd. Shanghai Branch</w:t>
       </w:r>
       <w:r>
         <w:rPr>
@@ -167,7 +167,7 @@
           <w:color w:val="333333"/>
           <w:sz w:val="19"/>
         </w:rPr>
-        <w:t>During my internship at NSFOCUS Technology, I was responsible for the deployment, policy configuration and basic operation and maintenance of security equipment such as firewalls, IDS/IPS, WAF, RSAS, etc., and was deeply involved in multiple maintenance compliance and security reinforcement projects for customers in the financial and manufacturing industries. Proficient in the implementation processes and troubleshooting methods of mainstream security products. On this basis, I independently developed the efficiency improvement tool HOS-LS (github.com/lxcxjxhx/HOS-LS) and successfully submitted it to the NSFOCUS project delivery tool platform; Actively join the "Security Operations-AI Empowered Operations Special Group", contribute to the document library BOS-NI (github.com/lxcxjxhx/BOS-NI), and assist the team in exploring the use of large models in alarm analysis and knowledge inspection. Implemented applications in scenarios such as cables. The above experience reflects my proactive thinking, hands-on implementation ability and project delivery awareness about information security &amp; AI.</w:t>
+        <w:t>Secure Product Delivery and O&amp;M: Independently responsible for the strategic configuration and troubleshooting of firewall, WAF, RSAs and other equipment, deeply involved in financial/manufacturing customers and other security compliance projects, with solid system engineering delivery capabilities.AI-enabled safe operation · PoC: Actively joined the company's "Security Operations-AI Empowerment Task Force" to lead the technical research of large model-assisted alarm analysis. Build a localized rag prototype system based on LangChain, complete the security log vector storage and Prompt project debugging, output the "Application Research Report of AI in Security Log Analysis" and share it within the group.Self-developed and effective tools put into production: Independent R&amp;D Rules Automated Inspection and Repair ToolHOS-LS, submitted to the Green Alliance Engineering Delivery Tool Platform and put into internal trial; build a lightweight safety knowledge baseBOS-NI, integrate semantic retrieval capabilities to help new hires quickly locate frequently asked questions.</w:t>
       </w:r>
     </w:p>
     <w:p>
@@ -182,7 +182,7 @@
           <w:color w:val="FFFFFF"/>
           <w:sz w:val="22"/>
         </w:rPr>
-        <w:t xml:space="preserve">  Project experience</w:t>
+        <w:t xml:space="preserve">  Project Experience</w:t>
       </w:r>
     </w:p>
     <w:p>
@@ -196,7 +196,7 @@
           <w:color w:val="2C3E50"/>
           <w:sz w:val="20"/>
         </w:rPr>
-        <w:t>Sino-US Maker National Award Project "Security Hyacinth" Information Security Attack, Defense and Technology Exchange Platform</w:t>
+        <w:t>Security Windshield Transducer – AI + Information Security Attack and Defense Training Platform</w:t>
       </w:r>
       <w:r>
         <w:rPr>
@@ -227,7 +227,7 @@
           <w:color w:val="34495E"/>
           <w:sz w:val="18"/>
         </w:rPr>
-        <w:t>Director &amp; Software Development</w:t>
+        <w:t>Leader &amp; Software Development | Won the China-US Maker Track National Award</w:t>
       </w:r>
     </w:p>
     <w:p>
@@ -242,7 +242,7 @@
           <w:color w:val="333333"/>
           <w:sz w:val="19"/>
         </w:rPr>
-        <w:t>Led a team of six people to jointly develop the "Security Hyacinth" AI+ information security attack, defense and learning platform, focusing on core functions such as terminal threat detection, AI-assisted vulnerability analysis, command line intelligent suggestions and log audit learning, adapting to multi-terminal and practical training scenarios . Lead the construction of the platform security system and be responsible for core aspects such as penetration testing auxiliary modules, command behavior analysis, attack log classification and visual response, to achieve rapid identification and feedback of abnormal behaviors. Combining large models such as Qwen to build an AI security confrontation engine, integrating knowledge graph and reinforcement learning technology to enhance the platform's capabilities in vulnerability mining, traceability analysis and other directions. The project has won the National Award of the Sino-US Maker Track, has software copyright, and is applying for a patent. It is committed to creating an intelligent attack and defense drill platform for practical training scenarios.</w:t>
+        <w:t>Lead a team of 6 people to build an integrated training platform for "Attack Simulation – Log Audit – Intelligent Response".Core technology to tackleSettings based on:Qwen-14BInstruction fine-tuning (LoRA), in conjunction withNeo4j Knowledge GraphAND:PPO Reinforcement LearningOptimize vulnerability exploit path recommendations; develop command-line intelligent auxiliary modules.Project landing: Design the attack log categorization and visual response module to achieve rapid traceability of abnormal behavior. Achievements: China-US Maker Country Award, soft and real review, patent writing.</w:t>
       </w:r>
     </w:p>
     <w:p>
@@ -256,7 +256,7 @@
           <w:color w:val="2C3E50"/>
           <w:sz w:val="20"/>
         </w:rPr>
-        <w:t>Intelligent Medical Language Companion Robot Team</w:t>
+        <w:t>Intelligent Medical Language Companion Robot – Medical AI Dialogue System</w:t>
       </w:r>
       <w:r>
         <w:rPr>
@@ -287,7 +287,7 @@
           <w:color w:val="34495E"/>
           <w:sz w:val="18"/>
         </w:rPr>
-        <w:t>Team members &amp; artificial intelligence application development</w:t>
+        <w:t>Team Member &amp; AI Application Development | Intel AI Innovation Competition Finalist</w:t>
       </w:r>
     </w:p>
     <w:p>
@@ -302,7 +302,7 @@
           <w:color w:val="333333"/>
           <w:sz w:val="19"/>
         </w:rPr>
-        <w:t>Participated in the Intel Artificial Intelligence Innovation Application Competition and developed the medical assistance project "Smart Medical Voice Companion Robot" based on the "AI PC" platform, aiming to improve the efficiency of primary care and the communication experience between doctors and patients. Responsible for the design of the voice data privacy protection mechanism in the project, leading communication link encryption, sensitive content identification, log compliance auditing and secure transmission strategy implementation to ensure data security and system stability in medical scenarios. At the same time, he participated in speech recognition optimization and user interaction process design to improve system accuracy and user experience. The project was successfully shortlisted for the Innovation and Entrepreneurship Special Competition (GBAC240303106392) and was highly recognized by the organizer, demonstrating the feasibility of AI in the safe implementation of medical data.</w:t>
+        <w:t>Develop intelligent consultation assistance robots for grassroots clinics based on the "AI PC" platform.Responsible for privacy security and AI interaction: Designed end-to-end communication encryption and sensitive content recognition mechanism (Bert fine-tuning classifier) to ensure medical data compliance; participated in speech recognition (Whisper fine-tuning) and intent understanding (LLM Few-shot) development.Shortlisted for the Intel Innovation and Entrepreneurship Special Competition (GBAC240303106392), highly recognized by the organizer.</w:t>
       </w:r>
     </w:p>
     <w:p>
@@ -331,7 +331,7 @@
           <w:color w:val="2C3E50"/>
           <w:sz w:val="19"/>
         </w:rPr>
-        <w:t>Language skills:</w:t>
+        <w:t>Language skills</w:t>
       </w:r>
       <w:r>
         <w:rPr>
@@ -340,7 +340,7 @@
           <w:color w:val="333333"/>
           <w:sz w:val="19"/>
         </w:rPr>
-        <w:t>English CET6 (411), Mandarin Level 2 B</w:t>
+        <w:t>English CET-6 (411), Mandarin Grade 2B</w:t>
       </w:r>
     </w:p>
     <w:p>
@@ -354,7 +354,7 @@
           <w:color w:val="2C3E50"/>
           <w:sz w:val="19"/>
         </w:rPr>
-        <w:t>Professional skills:</w:t>
+        <w:t>Professional Skill:</w:t>
       </w:r>
       <w:r>
         <w:rPr>
@@ -363,7 +363,7 @@
           <w:color w:val="333333"/>
           <w:sz w:val="19"/>
         </w:rPr>
-        <w:t>Familiar with Python and PyTorch framework, with practical experience in large model (RAG, code generation) training and tuning, and model compression and distillation. At the same time, he masters reinforcement learning and AI Agent development and application methods, has system security analysis and vulnerability mining capabilities, and is familiar with cutting-edge technology architectures such as MCP, skills, and langchain.</w:t>
+        <w:t>She is good at PyTorch/LangChain full link development and has the engineering ability to build AI prototype systems (rag, code generation, large model fine-tuning LoRA/QLoRA) and safety tools from 0 to 1. Master reinforcement learning (PPO), AI Agent development, model compression distillation, familiar with cutting-edge architectures such as MCP/Skills, and have practical experience in system security analysis and vulnerability mining.</w:t>
       </w:r>
     </w:p>
     <w:p>
@@ -377,7 +377,7 @@
           <w:color w:val="2C3E50"/>
           <w:sz w:val="19"/>
         </w:rPr>
-        <w:t>Office skills:</w:t>
+        <w:t>Office skills</w:t>
       </w:r>
       <w:r>
         <w:rPr>
@@ -386,7 +386,7 @@
           <w:color w:val="333333"/>
           <w:sz w:val="19"/>
         </w:rPr>
-        <w:t>EFG Entrepreneurship Training Camp Completion Certificate (75th Issue), Computer Level 1 Certificate, C2 Driver's License</w:t>
+        <w:t>EFG Entrepreneurship Training Camp Completion Certificate (Issue 75), Computer Level 1 Certificate, C2 Driver's License</w:t>
       </w:r>
     </w:p>
     <w:p>
@@ -401,7 +401,7 @@
           <w:color w:val="FFFFFF"/>
           <w:sz w:val="22"/>
         </w:rPr>
-        <w:t xml:space="preserve">  Open source contributions</w:t>
+        <w:t xml:space="preserve">  Open source contributions (all merged PR)</w:t>
       </w:r>
     </w:p>
     <w:p>
@@ -417,7 +417,7 @@
           <w:color w:val="FFFFFF"/>
           <w:sz w:val="15"/>
         </w:rPr>
-        <w:t xml:space="preserve">[Merged] </w:t>
+        <w:t xml:space="preserve">[Combined] </w:t>
       </w:r>
       <w:r>
         <w:rPr>
@@ -426,7 +426,7 @@
           <w:color w:val="3498DB"/>
           <w:sz w:val="18"/>
         </w:rPr>
-        <w:t>thc-hydra#1092</w:t>
+        <w:t>hiyouga/LlamaFactory</w:t>
       </w:r>
       <w:r>
         <w:rPr>
@@ -435,7 +435,7 @@
           <w:color w:val="333333"/>
           <w:sz w:val="18"/>
         </w:rPr>
-        <w:t xml:space="preserve"> - Merged- Fixed buffer overflow vulnerability in IMAP and SNMP handlers</w:t>
+        <w:t xml:space="preserve"> - Combined74,000 Stars# 10626 - Improve the Getting Started Guide document to lower the threshold for fine-tuning large models</w:t>
       </w:r>
     </w:p>
     <w:p>
@@ -451,7 +451,7 @@
           <w:color w:val="FFFFFF"/>
           <w:sz w:val="15"/>
         </w:rPr>
-        <w:t xml:space="preserve">[Merged] </w:t>
+        <w:t xml:space="preserve">[Combined] </w:t>
       </w:r>
       <w:r>
         <w:rPr>
@@ -460,7 +460,7 @@
           <w:color w:val="3498DB"/>
           <w:sz w:val="18"/>
         </w:rPr>
-        <w:t>thc-hydra#1091</w:t>
+        <w:t>axolotl-ai-cloud/axolotl</w:t>
       </w:r>
       <w:r>
         <w:rPr>
@@ -469,7 +469,7 @@
           <w:color w:val="333333"/>
           <w:sz w:val="18"/>
         </w:rPr>
-        <w:t xml:space="preserve"> - Merged- Fixed memory leak in authentication error path</w:t>
+        <w:t xml:space="preserve"> - Combined74,000 Stars# 3802 - Fix Jinja Chat Template Validation Error Prompt Logic</w:t>
       </w:r>
     </w:p>
     <w:p>
@@ -485,7 +485,7 @@
           <w:color w:val="FFFFFF"/>
           <w:sz w:val="15"/>
         </w:rPr>
-        <w:t xml:space="preserve">[Merged] </w:t>
+        <w:t xml:space="preserve">[Combined] </w:t>
       </w:r>
       <w:r>
         <w:rPr>
@@ -494,7 +494,7 @@
           <w:color w:val="3498DB"/>
           <w:sz w:val="18"/>
         </w:rPr>
-        <w:t>LlamaFactory#10626</w:t>
+        <w:t>vanhauser-thc/thc-hydra</w:t>
       </w:r>
       <w:r>
         <w:rPr>
@@ -503,7 +503,7 @@
           <w:color w:val="333333"/>
           <w:sz w:val="18"/>
         </w:rPr>
-        <w:t xml:space="preserve"> - Merged- Improved getting started guide documentation</w:t>
+        <w:t xml:space="preserve"> - Combined12,000 stars# 1092 Buffer Overflow |#1091Memory Leaks | etc Total 6 Consolidated Security Fixes PR</w:t>
       </w:r>
     </w:p>
     <w:p>
@@ -519,7 +519,7 @@
           <w:color w:val="FFFFFF"/>
           <w:sz w:val="15"/>
         </w:rPr>
-        <w:t xml:space="preserve">[Merged] </w:t>
+        <w:t xml:space="preserve">[Combined] </w:t>
       </w:r>
       <w:r>
         <w:rPr>
@@ -528,7 +528,7 @@
           <w:color w:val="3498DB"/>
           <w:sz w:val="18"/>
         </w:rPr>
-        <w:t>axolotl#3802</w:t>
+        <w:t>aquasecurity/trivy</w:t>
       </w:r>
       <w:r>
         <w:rPr>
@@ -537,7 +537,7 @@
           <w:color w:val="333333"/>
           <w:sz w:val="18"/>
         </w:rPr>
-        <w:t xml:space="preserve"> - Merged- Improved verification error prompts for jinja chat templates</w:t>
+        <w:t xml:space="preserve"> - Combined38,000 Stars# 11013 - Fix type assertion in Alpine APKINDEX archive read</w:t>
       </w:r>
     </w:p>
     <w:p>
@@ -553,7 +553,7 @@
           <w:color w:val="FFFFFF"/>
           <w:sz w:val="15"/>
         </w:rPr>
-        <w:t xml:space="preserve">[Merged] </w:t>
+        <w:t xml:space="preserve">[Combined] </w:t>
       </w:r>
       <w:r>
         <w:rPr>
@@ -562,7 +562,7 @@
           <w:color w:val="3498DB"/>
           <w:sz w:val="18"/>
         </w:rPr>
-        <w:t>checksec#349</w:t>
+        <w:t>zaproxy/zaproxy</w:t>
       </w:r>
       <w:r>
         <w:rPr>
@@ -571,7 +571,75 @@
           <w:color w:val="333333"/>
           <w:sz w:val="18"/>
         </w:rPr>
-        <w:t xml:space="preserve"> - Merged- Fix the processing when kernel.unprivileged_bpf_disabled value is 2</w:t>
+        <w:t xml:space="preserve"> - Combined16,000 stars# 9411 - HashUtils Resource Leak Fix</w:t>
+      </w:r>
+    </w:p>
+    <w:p>
+      <w:pPr>
+        <w:spacing w:before="20" w:after="20"/>
+        <w:ind w:left="283"/>
+        <w:shd w:fill="2c3e50" w:val="clear"/>
+      </w:pPr>
+      <w:r>
+        <w:rPr>
+          <w:rFonts w:ascii="Noto Sans CJK SC" w:hAnsi="Noto Sans CJK SC" w:eastAsia="Noto Sans CJK SC"/>
+          <w:b/>
+          <w:color w:val="FFFFFF"/>
+          <w:sz w:val="15"/>
+        </w:rPr>
+        <w:t xml:space="preserve">[Combined] </w:t>
+      </w:r>
+      <w:r>
+        <w:rPr>
+          <w:rFonts w:ascii="Noto Sans CJK SC" w:hAnsi="Noto Sans CJK SC" w:eastAsia="Noto Sans CJK SC"/>
+          <w:b/>
+          <w:color w:val="3498DB"/>
+          <w:sz w:val="18"/>
+        </w:rPr>
+        <w:t>slimm609/checksec</w:t>
+      </w:r>
+      <w:r>
+        <w:rPr>
+          <w:rFonts w:ascii="Noto Sans CJK SC" w:hAnsi="Noto Sans CJK SC" w:eastAsia="Noto Sans CJK SC"/>
+          <w:b w:val="0"/>
+          <w:color w:val="333333"/>
+          <w:sz w:val="18"/>
+        </w:rPr>
+        <w:t xml:space="preserve"> - Combined2.3k stars# 349 - Fix kernel.unprivileged_bpf_disabled detection logic</w:t>
+      </w:r>
+    </w:p>
+    <w:p>
+      <w:pPr>
+        <w:spacing w:before="20" w:after="20"/>
+        <w:ind w:left="283"/>
+        <w:shd w:fill="2c3e50" w:val="clear"/>
+      </w:pPr>
+      <w:r>
+        <w:rPr>
+          <w:rFonts w:ascii="Noto Sans CJK SC" w:hAnsi="Noto Sans CJK SC" w:eastAsia="Noto Sans CJK SC"/>
+          <w:b/>
+          <w:color w:val="FFFFFF"/>
+          <w:sz w:val="15"/>
+        </w:rPr>
+        <w:t xml:space="preserve">[Combined] </w:t>
+      </w:r>
+      <w:r>
+        <w:rPr>
+          <w:rFonts w:ascii="Noto Sans CJK SC" w:hAnsi="Noto Sans CJK SC" w:eastAsia="Noto Sans CJK SC"/>
+          <w:b/>
+          <w:color w:val="3498DB"/>
+          <w:sz w:val="18"/>
+        </w:rPr>
+        <w:t>bytedance/g3</w:t>
+      </w:r>
+      <w:r>
+        <w:rPr>
+          <w:rFonts w:ascii="Noto Sans CJK SC" w:hAnsi="Noto Sans CJK SC" w:eastAsia="Noto Sans CJK SC"/>
+          <w:b w:val="0"/>
+          <w:color w:val="333333"/>
+          <w:sz w:val="18"/>
+        </w:rPr>
+        <w:t xml:space="preserve"> - Combined888 Stars# 1103 - Fix unsafe unwrap () call in openssl certificate alignment</w:t>
       </w:r>
     </w:p>
     <w:p>
@@ -586,7 +654,7 @@
           <w:color w:val="FFFFFF"/>
           <w:sz w:val="22"/>
         </w:rPr>
-        <w:t xml:space="preserve">  introduce yourself</w:t>
+        <w:t xml:space="preserve">  Introduce yourself</w:t>
       </w:r>
     </w:p>
     <w:p>
@@ -601,7 +669,7 @@
           <w:color w:val="333333"/>
           <w:sz w:val="19"/>
         </w:rPr>
-        <w:t>Have solid foundation in AI technology, familiar with natural language processing (NLP), computer vision and full-stack algorithm development, large model application, data structure optimization and information security system design. Good at deeply integrating technology and operational needs, quickly learning and mastering cutting-edge technologies, and solving complex problems. Possess excellent team leadership and collaboration skills, able to efficiently lead the team to complete cross-domain projects and promote technology implementation and innovation. Clear logic, attention to details, and good at optimizing system performance and user experience through data-driven decision-making. Passionate about technology exploration and sharing, adaptable to fast-paced environment, covering computer vision, NLP, full-stack algorithms and technical operations.</w:t>
+        <w:t>The master's degree book is being read. With its extreme love for AI engineering and system security, it always maintains high-strength self-learning and output. He is good at PyTorch/LangChain full-link development, has the engineering ability to build AI prototype systems and security tools from 0 to 1, and has contributed code to many internationally renowned open source projects. Looking forward to transforming solid engineering foundations into highly reliable smart products.</w:t>
       </w:r>
     </w:p>
     <w:p>
@@ -616,7 +684,7 @@
           <w:color w:val="95A5A6"/>
           <w:sz w:val="15"/>
         </w:rPr>
-        <w:t>Last updated: July 14, 2026</w:t>
+        <w:t>Last Updated: August 23, 2026</w:t>
       </w:r>
     </w:p>
     <w:sectPr>

</xml_diff>